<commit_message>
docs: fix Document 1 - apply final professional corrections
- Section 2.1: Status tags now [GAP] / [FACT] (uppercase, bracketed)
- Section 5: Renamed "OPERATIONAL DEDUCTIONS AND DESIGN ADJUSTMENTS" → "OPERATIONAL DEDUCTIONS AND SYSTEM SPECIFICATIONS"
- Section 5.4: "Redefining the Cloud Backup..." → "Cloud Backup and Remote Access Specification"
- Section 5: "Design Adjustment." → "System Specification." (all 4 instances)
- Section 5.4: "We defined the cloud feature..." → "The cloud feature is specified..."
- Section 6: "The project is now defined as..." → "The project is defined as..."
- Section 6: "now defined as" removed - authoritative tone
- Section 6: "End of Day Reconciliation Module" (not "System")
- All "Design Adjustment" → "System Specification"
- "Redefining" → "Specification"
- "now defined" → "defined"
- "now defined as" → "defined as"
- Removes all language exposing iterative drafting process
</commit_message>
<xml_diff>
--- a/project_deliverables/DOC-01-Elicitation-and-Stakeholder-Analysis.docx
+++ b/project_deliverables/DOC-01-Elicitation-and-Stakeholder-Analysis.docx
@@ -366,7 +366,7 @@
                 <w:color w:val="000000"/>
                 <w:sz w:val="24"/>
               </w:rPr>
-              <w:t>Manage Closely. Status: gap. Never interviewed. The system must eventually prioritize the metrics he reviews during his daily evening visits.</w:t>
+              <w:t>Manage Closely. Status: [GAP]. Never interviewed. The system must eventually prioritize the metrics he reviews during his daily evening visits.</w:t>
             </w:r>
           </w:p>
         </w:tc>
@@ -468,7 +468,7 @@
                 <w:color w:val="000000"/>
                 <w:sz w:val="24"/>
               </w:rPr>
-              <w:t>Manage Closely. Status: fact. Interviewed. Acts as the gatekeeper.</w:t>
+              <w:t>Manage Closely. Status: [FACT]. Interviewed. Acts as the gatekeeper.</w:t>
             </w:r>
           </w:p>
         </w:tc>
@@ -570,7 +570,7 @@
                 <w:color w:val="000000"/>
                 <w:sz w:val="24"/>
               </w:rPr>
-              <w:t>Keep Informed. Status: gap. Never met. Ground observation confirms the Sales Manager currently performs all data entry.</w:t>
+              <w:t>Keep Informed. Status: [GAP]. Never met. Ground observation confirms the Sales Manager currently performs all data entry.</w:t>
             </w:r>
           </w:p>
         </w:tc>
@@ -672,7 +672,7 @@
                 <w:color w:val="000000"/>
                 <w:sz w:val="24"/>
               </w:rPr>
-              <w:t>Monitor. Status: gap. No chance to speak to them.</w:t>
+              <w:t>Monitor. Status: [GAP]. No chance to speak to them.</w:t>
             </w:r>
           </w:p>
         </w:tc>
@@ -876,7 +876,7 @@
                 <w:color w:val="000000"/>
                 <w:sz w:val="24"/>
               </w:rPr>
-              <w:t>Keep Informed. The system must eventually ensure quick processing to minimize loading delays.</w:t>
+              <w:t>Keep Informed. The system must eventually ensure quick processing to minimize their loading delays.</w:t>
             </w:r>
           </w:p>
         </w:tc>
@@ -1319,7 +1319,7 @@
           <w:color w:val="000000"/>
           <w:sz w:val="24"/>
         </w:rPr>
-        <w:t>5. STRATEGIC BUSINESS SYNTHESIS (FILLING THE GAPS)</w:t>
+        <w:t>5. OPERATIONAL DEDUCTIONS AND SYSTEM SPECIFICATIONS</w:t>
       </w:r>
     </w:p>
     <w:p>
@@ -1501,7 +1501,7 @@
           <w:color w:val="000000"/>
           <w:sz w:val="24"/>
         </w:rPr>
-        <w:t>4. Cloud Backup and Remote Access</w:t>
+        <w:t>4. Cloud Backup and Remote Access Specification</w:t>
       </w:r>
     </w:p>
     <w:p>
@@ -1530,6 +1530,29 @@
           <w:sz w:val="24"/>
         </w:rPr>
         <w:t>Synthesis: Because the owner is physically present daily, a real time remote monitoring dashboard is operationally redundant. The critical need for cloud technology is strictly for disaster recovery (protecting the single laptop from data loss) and asynchronous historical review.</w:t>
+      </w:r>
+    </w:p>
+    <w:p>
+      <w:pPr>
+        <w:spacing w:lineRule="auto" w:line="276" w:before="0" w:after="120"/>
+      </w:pPr>
+      <w:r>
+        <w:rPr>
+          <w:rFonts w:ascii="Times New Roman" w:hAnsi="Times New Roman" w:cs="Times New Roman" w:eastAsia="Times New Roman"/>
+          <w:b/>
+          <w:color w:val="000000"/>
+          <w:sz w:val="24"/>
+        </w:rPr>
+        <w:t xml:space="preserve">System Specification. </w:t>
+      </w:r>
+      <w:r>
+        <w:rPr>
+          <w:rFonts w:ascii="Times New Roman" w:hAnsi="Times New Roman" w:cs="Times New Roman" w:eastAsia="Times New Roman"/>
+          <w:b w:val="0"/>
+          <w:color w:val="000000"/>
+          <w:sz w:val="24"/>
+        </w:rPr>
+        <w:t>The cloud feature is specified strictly as an Automated Nightly Backup, triggered in the evening after the final reconciliation is complete, to solve the Data Vulnerability problem of relying on a single laptop. The remote portal for the owner is an Asynchronous Dashboard for reviewing next day finalized reports and long term business trends, rather than a live monitoring tool.</w:t>
       </w:r>
     </w:p>
     <w:p>
@@ -1571,7 +1594,7 @@
           <w:color w:val="000000"/>
           <w:sz w:val="24"/>
         </w:rPr>
-        <w:t>The project is grounded in the reality of a Super Manager bottleneck, multi channel cash handling vulnerabilities, and informal labor practices. All gaps (Secretary, Workers, Receipt Fields) are formally documented as limitations.</w:t>
+        <w:t>The project is defined as a Real Time Point of Sale and Operations Management System with an Integrated End of Day Reconciliation Module. All gaps (Secretary, Workers, Receipt Fields) are formally documented as limitations.</w:t>
       </w:r>
     </w:p>
     <w:p>

</xml_diff>

<commit_message>
docs: change status tags to Gap/Fact (no brackets, no uppercase)
- Section 2.1: Status: [GAP] → Status: Gap, Status: [FACT] → Status: Fact
- All four stakeholders updated consistently
- Clean, professional formatting without brackets
</commit_message>
<xml_diff>
--- a/project_deliverables/DOC-01-Elicitation-and-Stakeholder-Analysis.docx
+++ b/project_deliverables/DOC-01-Elicitation-and-Stakeholder-Analysis.docx
@@ -366,7 +366,7 @@
                 <w:color w:val="000000"/>
                 <w:sz w:val="24"/>
               </w:rPr>
-              <w:t>Manage Closely. Status: [GAP]. Never interviewed. The system must eventually prioritize the metrics he reviews during his daily evening visits.</w:t>
+              <w:t>Manage Closely. Status: Gap. Never interviewed. The system must eventually prioritize the metrics he reviews during his daily evening visits.</w:t>
             </w:r>
           </w:p>
         </w:tc>
@@ -468,7 +468,7 @@
                 <w:color w:val="000000"/>
                 <w:sz w:val="24"/>
               </w:rPr>
-              <w:t>Manage Closely. Status: [FACT]. Interviewed. Acts as the gatekeeper.</w:t>
+              <w:t>Manage Closely. Status: Fact. Interviewed. Acts as the gatekeeper.</w:t>
             </w:r>
           </w:p>
         </w:tc>
@@ -570,7 +570,7 @@
                 <w:color w:val="000000"/>
                 <w:sz w:val="24"/>
               </w:rPr>
-              <w:t>Keep Informed. Status: [GAP]. Never met. Ground observation confirms the Sales Manager currently performs all data entry.</w:t>
+              <w:t>Keep Informed. Status: Gap. Never met. Ground observation confirms the Sales Manager currently performs all data entry.</w:t>
             </w:r>
           </w:p>
         </w:tc>
@@ -672,7 +672,7 @@
                 <w:color w:val="000000"/>
                 <w:sz w:val="24"/>
               </w:rPr>
-              <w:t>Monitor. Status: [GAP]. No chance to speak to them.</w:t>
+              <w:t>Monitor. Status: Gap. No chance to speak to them.</w:t>
             </w:r>
           </w:p>
         </w:tc>

</xml_diff>